<commit_message>
Phase 2: Complete submission package
Cover letter:
- Changed "Article" → "Perspective"
- Section: "Information Theory, Probability and Statistics"
- Replaced Wolpert with Crutchfield (UC Davis)
- Fixed Kolchinsky affiliation: Universitat Pompeu Fabra
- Updated author affiliation: 199 Biotechnologies
- Mentioned computed C_u with Landauer-referenced dissipation

Paper (Typst + PDF):
- Added back-matter: Author Contributions, Funding,
  Data Availability, Conflicts of Interest
- Discloses 199 Biotechnologies founding
- Links to computation code repository

Docx:
- Updated Table 1 with exact computed values (7 columns)
- Added all 4 MDPI back-matter sections
- Conflicts discloses 199 Biotechnologies

GPT-Pro review package:
- 10 files + 28-point review prompt
- Includes paper, code, data, cover letter, graphical abstract
</commit_message>
<xml_diff>
--- a/Intelligence_as_Useful_Structure.docx
+++ b/Intelligence_as_Useful_Structure.docx
@@ -1012,20 +1012,46 @@
           <w:sz w:val="20"/>
           <w:szCs w:val="20"/>
         </w:rPr>
-        <w:t xml:space="preserve">Consider a minimal control task. A binary latent variable z ∈ {0,1} determines which action keeps an agent inside the viability set. Observations also contain a nuisance bit n ∈ {0,1} that is irrelevant to viability. Agents are trained on the same hardware and task family.</w:t>
-      </w:r>
-    </w:p>
-    <w:p>
-      <w:pPr>
-        <w:spacing w:after="120" w:line="276"/>
-      </w:pPr>
-      <w:r>
-        <w:rPr>
-          <w:rFonts w:ascii="Times New Roman" w:cs="Times New Roman" w:eastAsia="Times New Roman" w:hAnsi="Times New Roman"/>
-          <w:sz w:val="20"/>
-          <w:szCs w:val="20"/>
-        </w:rPr>
-        <w:t xml:space="preserve">The first agent learns the latent rule: it tracks z and chooses the viability-preserving action. The second memorises the four seen observation-action pairs (z,n) ↦ a as a lookup table. The third memorises only the nuisance bit. Suppose all three agents are evaluated over the same learning episode with dissipated work measured in the same arbitrary energy units.</w:t>
+        <w:t xml:space="preserve">Consider a minimal control task. A binary latent variable z ∈ {0,1} determines which action keeps an agent inside the viability set. Observations also contain a nuisance bit n ∈ {0,1} that is irrelevant to viability. Three agents are trained on the same hardware and task family over K = 8 i.i.d. episodes, each presenting a uniformly drawn (z, n) pair with reward r = 1{a = z}.</w:t>
+      </w:r>
+    </w:p>
+    <w:p>
+      <w:pPr>
+        <w:spacing w:after="120" w:line="276"/>
+      </w:pPr>
+      <w:r>
+        <w:rPr>
+          <w:rFonts w:ascii="Times New Roman" w:cs="Times New Roman" w:eastAsia="Times New Roman" w:hAnsi="Times New Roman"/>
+          <w:sz w:val="20"/>
+          <w:szCs w:val="20"/>
+        </w:rPr>
+        <w:t xml:space="preserve">The first agent learns the latent rule: its internal representation is M = z, compressing the two-bit observation to the one bit that matters. The second memorises all four observation–action pairs, storing M = (z, n). The third memorises only the nuisance bit, setting M = n.</w:t>
+      </w:r>
+    </w:p>
+    <w:p>
+      <w:pPr>
+        <w:spacing w:after="120" w:line="276"/>
+      </w:pPr>
+      <w:r>
+        <w:rPr>
+          <w:rFonts w:ascii="Times New Roman" w:cs="Times New Roman" w:eastAsia="Times New Roman" w:hAnsi="Times New Roman"/>
+          <w:sz w:val="20"/>
+          <w:szCs w:val="20"/>
+        </w:rPr>
+        <w:t xml:space="preserve">We compute C_u = I(M; Z) exactly by constructing the joint distribution P(M, Z) for each agent, where Z = z is the viability-relevant variable. Because z and n are independent and uniform, the rule learner and lookup table both achieve C_u = 1 bit (all information about Z is preserved), while the noise memoriser achieves C_u = 0 bits (M is independent of Z). The lookup table stores H(M) = 2 bits total—one bit of nuisance is stored without increasing useful structure.</w:t>
+      </w:r>
+    </w:p>
+    <w:p>
+      <w:pPr>
+        <w:spacing w:after="120" w:line="276"/>
+      </w:pPr>
+      <w:r>
+        <w:rPr>
+          <w:rFonts w:ascii="Times New Roman" w:cs="Times New Roman" w:eastAsia="Times New Roman" w:hAnsi="Times New Roman"/>
+          <w:sz w:val="20"/>
+          <w:szCs w:val="20"/>
+        </w:rPr>
+        <w:t xml:space="preserve">Dissipated work is estimated at the Landauer floor. Each training episode requires a fixed number of irreversible bit erasures determined by the agent’s architecture: two erasures per episode for a one-bit register (compare and update), three for a four-entry lookup table (address, compare, update). Over K = 8 episodes, the rule learner and noise memoriser each dissipate W_diss = 16 k_B T ln 2 while the lookup table dissipates W_diss = 24 k_B T ln 2. At T = 300 K, one k_B T ln 2 ≈ 2.87 zJ.</w:t>
       </w:r>
     </w:p>
     <w:p>
@@ -1050,7 +1076,7 @@
           <w:sz w:val="20"/>
           <w:szCs w:val="20"/>
         </w:rPr>
-        <w:t xml:space="preserve">Illustrative toy calculation. Energy units are arbitrary.</w:t>
+        <w:t xml:space="preserve">Exact toy calculation. C_u computed analytically from joint distributions. W_diss counted at the Landauer floor (k_B T ln 2 per bit erasure, T = 300 K). Adaptive reach A estimated over 1000 environments with varying nuisance dimensionality.</w:t>
       </w:r>
     </w:p>
     <w:tbl>
@@ -1066,17 +1092,18 @@
         </w:tblBorders>
       </w:tblPr>
       <w:tblGrid>
-        <w:gridCol w:w="1800"/>
-        <w:gridCol w:w="2200"/>
+        <w:gridCol w:w="1600"/>
         <w:gridCol w:w="800"/>
-        <w:gridCol w:w="900"/>
-        <w:gridCol w:w="900"/>
-        <w:gridCol w:w="2426"/>
+        <w:gridCol w:w="800"/>
+        <w:gridCol w:w="1500"/>
+        <w:gridCol w:w="1126"/>
+        <w:gridCol w:w="1100"/>
+        <w:gridCol w:w="1100"/>
       </w:tblGrid>
       <w:tr>
         <w:tc>
           <w:tcPr>
-            <w:tcW w:type="dxa" w:w="1800"/>
+            <w:tcW w:type="dxa" w:w="1600"/>
             <w:tcBorders>
               <w:top w:val="single" w:color="999999" w:sz="1"/>
               <w:left w:val="single" w:color="999999" w:sz="1"/>
@@ -1109,7 +1136,7 @@
         </w:tc>
         <w:tc>
           <w:tcPr>
-            <w:tcW w:type="dxa" w:w="2200"/>
+            <w:tcW w:type="dxa" w:w="800"/>
             <w:tcBorders>
               <w:top w:val="single" w:color="999999" w:sz="1"/>
               <w:left w:val="single" w:color="999999" w:sz="1"/>
@@ -1136,7 +1163,7 @@
                 <w:sz w:val="18"/>
                 <w:szCs w:val="18"/>
               </w:rPr>
-              <w:t xml:space="preserve">Stored structure</w:t>
+              <w:t xml:space="preserve">H(M)</w:t>
             </w:r>
           </w:p>
         </w:tc>
@@ -1175,7 +1202,7 @@
         </w:tc>
         <w:tc>
           <w:tcPr>
-            <w:tcW w:type="dxa" w:w="900"/>
+            <w:tcW w:type="dxa" w:w="1500"/>
             <w:tcBorders>
               <w:top w:val="single" w:color="999999" w:sz="1"/>
               <w:left w:val="single" w:color="999999" w:sz="1"/>
@@ -1208,7 +1235,7 @@
         </w:tc>
         <w:tc>
           <w:tcPr>
-            <w:tcW w:type="dxa" w:w="900"/>
+            <w:tcW w:type="dxa" w:w="1126"/>
             <w:tcBorders>
               <w:top w:val="single" w:color="999999" w:sz="1"/>
               <w:left w:val="single" w:color="999999" w:sz="1"/>
@@ -1235,13 +1262,13 @@
                 <w:sz w:val="18"/>
                 <w:szCs w:val="18"/>
               </w:rPr>
-              <w:t xml:space="preserve">I_eff</w:t>
-            </w:r>
-          </w:p>
-        </w:tc>
-        <w:tc>
-          <w:tcPr>
-            <w:tcW w:type="dxa" w:w="2426"/>
+              <w:t xml:space="preserve">I*_eff</w:t>
+            </w:r>
+          </w:p>
+        </w:tc>
+        <w:tc>
+          <w:tcPr>
+            <w:tcW w:type="dxa" w:w="1100"/>
             <w:tcBorders>
               <w:top w:val="single" w:color="999999" w:sz="1"/>
               <w:left w:val="single" w:color="999999" w:sz="1"/>
@@ -1268,7 +1295,40 @@
                 <w:sz w:val="18"/>
                 <w:szCs w:val="18"/>
               </w:rPr>
-              <w:t xml:space="preserve">Held-out reach</w:t>
+              <w:t xml:space="preserve">A</w:t>
+            </w:r>
+          </w:p>
+        </w:tc>
+        <w:tc>
+          <w:tcPr>
+            <w:tcW w:type="dxa" w:w="1100"/>
+            <w:tcBorders>
+              <w:top w:val="single" w:color="999999" w:sz="1"/>
+              <w:left w:val="single" w:color="999999" w:sz="1"/>
+              <w:bottom w:val="single" w:color="999999" w:sz="1"/>
+              <w:right w:val="single" w:color="999999" w:sz="1"/>
+            </w:tcBorders>
+            <w:shd w:fill="E8E8E8" w:val="clear"/>
+            <w:tcMar>
+              <w:top w:type="dxa" w:w="60"/>
+              <w:left w:type="dxa" w:w="100"/>
+              <w:bottom w:type="dxa" w:w="60"/>
+              <w:right w:type="dxa" w:w="100"/>
+            </w:tcMar>
+          </w:tcPr>
+          <w:p>
+            <w:pPr>
+              <w:spacing w:after="0"/>
+            </w:pPr>
+            <w:r>
+              <w:rPr>
+                <w:rFonts w:ascii="Times New Roman" w:cs="Times New Roman" w:eastAsia="Times New Roman" w:hAnsi="Times New Roman"/>
+                <w:b/>
+                <w:bCs/>
+                <w:sz w:val="18"/>
+                <w:szCs w:val="18"/>
+              </w:rPr>
+              <w:t xml:space="preserve">Acc (train)</w:t>
             </w:r>
           </w:p>
         </w:tc>
@@ -1276,7 +1336,7 @@
       <w:tr>
         <w:tc>
           <w:tcPr>
-            <w:tcW w:type="dxa" w:w="1800"/>
+            <w:tcW w:type="dxa" w:w="1600"/>
             <w:tcBorders>
               <w:top w:val="single" w:color="999999" w:sz="1"/>
               <w:left w:val="single" w:color="999999" w:sz="1"/>
@@ -1308,38 +1368,6 @@
         </w:tc>
         <w:tc>
           <w:tcPr>
-            <w:tcW w:type="dxa" w:w="2200"/>
-            <w:tcBorders>
-              <w:top w:val="single" w:color="999999" w:sz="1"/>
-              <w:left w:val="single" w:color="999999" w:sz="1"/>
-              <w:bottom w:val="single" w:color="999999" w:sz="1"/>
-              <w:right w:val="single" w:color="999999" w:sz="1"/>
-            </w:tcBorders>
-            <w:tcMar>
-              <w:top w:type="dxa" w:w="60"/>
-              <w:left w:type="dxa" w:w="100"/>
-              <w:bottom w:type="dxa" w:w="60"/>
-              <w:right w:type="dxa" w:w="100"/>
-            </w:tcMar>
-          </w:tcPr>
-          <w:p>
-            <w:pPr>
-              <w:spacing w:after="0"/>
-            </w:pPr>
-            <w:r>
-              <w:rPr>
-                <w:rFonts w:ascii="Times New Roman" w:cs="Times New Roman" w:eastAsia="Times New Roman" w:hAnsi="Times New Roman"/>
-                <w:b w:val="false"/>
-                <w:bCs w:val="false"/>
-                <w:sz w:val="18"/>
-                <w:szCs w:val="18"/>
-              </w:rPr>
-              <w:t xml:space="preserve">Tracks viability-relevant z</w:t>
-            </w:r>
-          </w:p>
-        </w:tc>
-        <w:tc>
-          <w:tcPr>
             <w:tcW w:type="dxa" w:w="800"/>
             <w:tcBorders>
               <w:top w:val="single" w:color="999999" w:sz="1"/>
@@ -1372,97 +1400,161 @@
         </w:tc>
         <w:tc>
           <w:tcPr>
-            <w:tcW w:type="dxa" w:w="900"/>
-            <w:tcBorders>
-              <w:top w:val="single" w:color="999999" w:sz="1"/>
-              <w:left w:val="single" w:color="999999" w:sz="1"/>
-              <w:bottom w:val="single" w:color="999999" w:sz="1"/>
-              <w:right w:val="single" w:color="999999" w:sz="1"/>
-            </w:tcBorders>
-            <w:tcMar>
-              <w:top w:type="dxa" w:w="60"/>
-              <w:left w:type="dxa" w:w="100"/>
-              <w:bottom w:type="dxa" w:w="60"/>
-              <w:right w:type="dxa" w:w="100"/>
-            </w:tcMar>
-          </w:tcPr>
-          <w:p>
-            <w:pPr>
-              <w:spacing w:after="0"/>
-            </w:pPr>
-            <w:r>
-              <w:rPr>
-                <w:rFonts w:ascii="Times New Roman" w:cs="Times New Roman" w:eastAsia="Times New Roman" w:hAnsi="Times New Roman"/>
-                <w:b w:val="false"/>
-                <w:bCs w:val="false"/>
-                <w:sz w:val="18"/>
-                <w:szCs w:val="18"/>
-              </w:rPr>
-              <w:t xml:space="preserve">10</w:t>
-            </w:r>
-          </w:p>
-        </w:tc>
-        <w:tc>
-          <w:tcPr>
-            <w:tcW w:type="dxa" w:w="900"/>
-            <w:tcBorders>
-              <w:top w:val="single" w:color="999999" w:sz="1"/>
-              <w:left w:val="single" w:color="999999" w:sz="1"/>
-              <w:bottom w:val="single" w:color="999999" w:sz="1"/>
-              <w:right w:val="single" w:color="999999" w:sz="1"/>
-            </w:tcBorders>
-            <w:tcMar>
-              <w:top w:type="dxa" w:w="60"/>
-              <w:left w:type="dxa" w:w="100"/>
-              <w:bottom w:type="dxa" w:w="60"/>
-              <w:right w:type="dxa" w:w="100"/>
-            </w:tcMar>
-          </w:tcPr>
-          <w:p>
-            <w:pPr>
-              <w:spacing w:after="0"/>
-            </w:pPr>
-            <w:r>
-              <w:rPr>
-                <w:rFonts w:ascii="Times New Roman" w:cs="Times New Roman" w:eastAsia="Times New Roman" w:hAnsi="Times New Roman"/>
-                <w:b w:val="false"/>
-                <w:bCs w:val="false"/>
-                <w:sz w:val="18"/>
-                <w:szCs w:val="18"/>
-              </w:rPr>
-              <w:t xml:space="preserve">0.10</w:t>
-            </w:r>
-          </w:p>
-        </w:tc>
-        <w:tc>
-          <w:tcPr>
-            <w:tcW w:type="dxa" w:w="2426"/>
-            <w:tcBorders>
-              <w:top w:val="single" w:color="999999" w:sz="1"/>
-              <w:left w:val="single" w:color="999999" w:sz="1"/>
-              <w:bottom w:val="single" w:color="999999" w:sz="1"/>
-              <w:right w:val="single" w:color="999999" w:sz="1"/>
-            </w:tcBorders>
-            <w:tcMar>
-              <w:top w:type="dxa" w:w="60"/>
-              <w:left w:type="dxa" w:w="100"/>
-              <w:bottom w:type="dxa" w:w="60"/>
-              <w:right w:type="dxa" w:w="100"/>
-            </w:tcMar>
-          </w:tcPr>
-          <w:p>
-            <w:pPr>
-              <w:spacing w:after="0"/>
-            </w:pPr>
-            <w:r>
-              <w:rPr>
-                <w:rFonts w:ascii="Times New Roman" w:cs="Times New Roman" w:eastAsia="Times New Roman" w:hAnsi="Times New Roman"/>
-                <w:b w:val="false"/>
-                <w:bCs w:val="false"/>
-                <w:sz w:val="18"/>
-                <w:szCs w:val="18"/>
-              </w:rPr>
-              <w:t xml:space="preserve">High</w:t>
+            <w:tcW w:type="dxa" w:w="800"/>
+            <w:tcBorders>
+              <w:top w:val="single" w:color="999999" w:sz="1"/>
+              <w:left w:val="single" w:color="999999" w:sz="1"/>
+              <w:bottom w:val="single" w:color="999999" w:sz="1"/>
+              <w:right w:val="single" w:color="999999" w:sz="1"/>
+            </w:tcBorders>
+            <w:tcMar>
+              <w:top w:type="dxa" w:w="60"/>
+              <w:left w:type="dxa" w:w="100"/>
+              <w:bottom w:type="dxa" w:w="60"/>
+              <w:right w:type="dxa" w:w="100"/>
+            </w:tcMar>
+          </w:tcPr>
+          <w:p>
+            <w:pPr>
+              <w:spacing w:after="0"/>
+            </w:pPr>
+            <w:r>
+              <w:rPr>
+                <w:rFonts w:ascii="Times New Roman" w:cs="Times New Roman" w:eastAsia="Times New Roman" w:hAnsi="Times New Roman"/>
+                <w:b w:val="false"/>
+                <w:bCs w:val="false"/>
+                <w:sz w:val="18"/>
+                <w:szCs w:val="18"/>
+              </w:rPr>
+              <w:t xml:space="preserve">1 bit</w:t>
+            </w:r>
+          </w:p>
+        </w:tc>
+        <w:tc>
+          <w:tcPr>
+            <w:tcW w:type="dxa" w:w="1500"/>
+            <w:tcBorders>
+              <w:top w:val="single" w:color="999999" w:sz="1"/>
+              <w:left w:val="single" w:color="999999" w:sz="1"/>
+              <w:bottom w:val="single" w:color="999999" w:sz="1"/>
+              <w:right w:val="single" w:color="999999" w:sz="1"/>
+            </w:tcBorders>
+            <w:tcMar>
+              <w:top w:type="dxa" w:w="60"/>
+              <w:left w:type="dxa" w:w="100"/>
+              <w:bottom w:type="dxa" w:w="60"/>
+              <w:right w:type="dxa" w:w="100"/>
+            </w:tcMar>
+          </w:tcPr>
+          <w:p>
+            <w:pPr>
+              <w:spacing w:after="0"/>
+            </w:pPr>
+            <w:r>
+              <w:rPr>
+                <w:rFonts w:ascii="Times New Roman" w:cs="Times New Roman" w:eastAsia="Times New Roman" w:hAnsi="Times New Roman"/>
+                <w:b w:val="false"/>
+                <w:bCs w:val="false"/>
+                <w:sz w:val="18"/>
+                <w:szCs w:val="18"/>
+              </w:rPr>
+              <w:t xml:space="preserve">16 k_B T ln 2</w:t>
+            </w:r>
+          </w:p>
+        </w:tc>
+        <w:tc>
+          <w:tcPr>
+            <w:tcW w:type="dxa" w:w="1126"/>
+            <w:tcBorders>
+              <w:top w:val="single" w:color="999999" w:sz="1"/>
+              <w:left w:val="single" w:color="999999" w:sz="1"/>
+              <w:bottom w:val="single" w:color="999999" w:sz="1"/>
+              <w:right w:val="single" w:color="999999" w:sz="1"/>
+            </w:tcBorders>
+            <w:tcMar>
+              <w:top w:type="dxa" w:w="60"/>
+              <w:left w:type="dxa" w:w="100"/>
+              <w:bottom w:type="dxa" w:w="60"/>
+              <w:right w:type="dxa" w:w="100"/>
+            </w:tcMar>
+          </w:tcPr>
+          <w:p>
+            <w:pPr>
+              <w:spacing w:after="0"/>
+            </w:pPr>
+            <w:r>
+              <w:rPr>
+                <w:rFonts w:ascii="Times New Roman" w:cs="Times New Roman" w:eastAsia="Times New Roman" w:hAnsi="Times New Roman"/>
+                <w:b w:val="false"/>
+                <w:bCs w:val="false"/>
+                <w:sz w:val="18"/>
+                <w:szCs w:val="18"/>
+              </w:rPr>
+              <w:t xml:space="preserve">0.0625</w:t>
+            </w:r>
+          </w:p>
+        </w:tc>
+        <w:tc>
+          <w:tcPr>
+            <w:tcW w:type="dxa" w:w="1100"/>
+            <w:tcBorders>
+              <w:top w:val="single" w:color="999999" w:sz="1"/>
+              <w:left w:val="single" w:color="999999" w:sz="1"/>
+              <w:bottom w:val="single" w:color="999999" w:sz="1"/>
+              <w:right w:val="single" w:color="999999" w:sz="1"/>
+            </w:tcBorders>
+            <w:tcMar>
+              <w:top w:type="dxa" w:w="60"/>
+              <w:left w:type="dxa" w:w="100"/>
+              <w:bottom w:type="dxa" w:w="60"/>
+              <w:right w:type="dxa" w:w="100"/>
+            </w:tcMar>
+          </w:tcPr>
+          <w:p>
+            <w:pPr>
+              <w:spacing w:after="0"/>
+            </w:pPr>
+            <w:r>
+              <w:rPr>
+                <w:rFonts w:ascii="Times New Roman" w:cs="Times New Roman" w:eastAsia="Times New Roman" w:hAnsi="Times New Roman"/>
+                <w:b w:val="false"/>
+                <w:bCs w:val="false"/>
+                <w:sz w:val="18"/>
+                <w:szCs w:val="18"/>
+              </w:rPr>
+              <w:t xml:space="preserve">1.00</w:t>
+            </w:r>
+          </w:p>
+        </w:tc>
+        <w:tc>
+          <w:tcPr>
+            <w:tcW w:type="dxa" w:w="1100"/>
+            <w:tcBorders>
+              <w:top w:val="single" w:color="999999" w:sz="1"/>
+              <w:left w:val="single" w:color="999999" w:sz="1"/>
+              <w:bottom w:val="single" w:color="999999" w:sz="1"/>
+              <w:right w:val="single" w:color="999999" w:sz="1"/>
+            </w:tcBorders>
+            <w:tcMar>
+              <w:top w:type="dxa" w:w="60"/>
+              <w:left w:type="dxa" w:w="100"/>
+              <w:bottom w:type="dxa" w:w="60"/>
+              <w:right w:type="dxa" w:w="100"/>
+            </w:tcMar>
+          </w:tcPr>
+          <w:p>
+            <w:pPr>
+              <w:spacing w:after="0"/>
+            </w:pPr>
+            <w:r>
+              <w:rPr>
+                <w:rFonts w:ascii="Times New Roman" w:cs="Times New Roman" w:eastAsia="Times New Roman" w:hAnsi="Times New Roman"/>
+                <w:b w:val="false"/>
+                <w:bCs w:val="false"/>
+                <w:sz w:val="18"/>
+                <w:szCs w:val="18"/>
+              </w:rPr>
+              <w:t xml:space="preserve">1.00</w:t>
             </w:r>
           </w:p>
         </w:tc>
@@ -1470,7 +1562,7 @@
       <w:tr>
         <w:tc>
           <w:tcPr>
-            <w:tcW w:type="dxa" w:w="1800"/>
+            <w:tcW w:type="dxa" w:w="1600"/>
             <w:tcBorders>
               <w:top w:val="single" w:color="999999" w:sz="1"/>
               <w:left w:val="single" w:color="999999" w:sz="1"/>
@@ -1502,38 +1594,6 @@
         </w:tc>
         <w:tc>
           <w:tcPr>
-            <w:tcW w:type="dxa" w:w="2200"/>
-            <w:tcBorders>
-              <w:top w:val="single" w:color="999999" w:sz="1"/>
-              <w:left w:val="single" w:color="999999" w:sz="1"/>
-              <w:bottom w:val="single" w:color="999999" w:sz="1"/>
-              <w:right w:val="single" w:color="999999" w:sz="1"/>
-            </w:tcBorders>
-            <w:tcMar>
-              <w:top w:type="dxa" w:w="60"/>
-              <w:left w:type="dxa" w:w="100"/>
-              <w:bottom w:type="dxa" w:w="60"/>
-              <w:right w:type="dxa" w:w="100"/>
-            </w:tcMar>
-          </w:tcPr>
-          <w:p>
-            <w:pPr>
-              <w:spacing w:after="0"/>
-            </w:pPr>
-            <w:r>
-              <w:rPr>
-                <w:rFonts w:ascii="Times New Roman" w:cs="Times New Roman" w:eastAsia="Times New Roman" w:hAnsi="Times New Roman"/>
-                <w:b w:val="false"/>
-                <w:bCs w:val="false"/>
-                <w:sz w:val="18"/>
-                <w:szCs w:val="18"/>
-              </w:rPr>
-              <w:t xml:space="preserve">Stores four (z,n)↦a pairs</w:t>
-            </w:r>
-          </w:p>
-        </w:tc>
-        <w:tc>
-          <w:tcPr>
             <w:tcW w:type="dxa" w:w="800"/>
             <w:tcBorders>
               <w:top w:val="single" w:color="999999" w:sz="1"/>
@@ -1560,103 +1620,167 @@
                 <w:sz w:val="18"/>
                 <w:szCs w:val="18"/>
               </w:rPr>
+              <w:t xml:space="preserve">2 bits</w:t>
+            </w:r>
+          </w:p>
+        </w:tc>
+        <w:tc>
+          <w:tcPr>
+            <w:tcW w:type="dxa" w:w="800"/>
+            <w:tcBorders>
+              <w:top w:val="single" w:color="999999" w:sz="1"/>
+              <w:left w:val="single" w:color="999999" w:sz="1"/>
+              <w:bottom w:val="single" w:color="999999" w:sz="1"/>
+              <w:right w:val="single" w:color="999999" w:sz="1"/>
+            </w:tcBorders>
+            <w:tcMar>
+              <w:top w:type="dxa" w:w="60"/>
+              <w:left w:type="dxa" w:w="100"/>
+              <w:bottom w:type="dxa" w:w="60"/>
+              <w:right w:type="dxa" w:w="100"/>
+            </w:tcMar>
+          </w:tcPr>
+          <w:p>
+            <w:pPr>
+              <w:spacing w:after="0"/>
+            </w:pPr>
+            <w:r>
+              <w:rPr>
+                <w:rFonts w:ascii="Times New Roman" w:cs="Times New Roman" w:eastAsia="Times New Roman" w:hAnsi="Times New Roman"/>
+                <w:b w:val="false"/>
+                <w:bCs w:val="false"/>
+                <w:sz w:val="18"/>
+                <w:szCs w:val="18"/>
+              </w:rPr>
               <w:t xml:space="preserve">1 bit</w:t>
             </w:r>
           </w:p>
         </w:tc>
         <w:tc>
           <w:tcPr>
-            <w:tcW w:type="dxa" w:w="900"/>
-            <w:tcBorders>
-              <w:top w:val="single" w:color="999999" w:sz="1"/>
-              <w:left w:val="single" w:color="999999" w:sz="1"/>
-              <w:bottom w:val="single" w:color="999999" w:sz="1"/>
-              <w:right w:val="single" w:color="999999" w:sz="1"/>
-            </w:tcBorders>
-            <w:tcMar>
-              <w:top w:type="dxa" w:w="60"/>
-              <w:left w:type="dxa" w:w="100"/>
-              <w:bottom w:type="dxa" w:w="60"/>
-              <w:right w:type="dxa" w:w="100"/>
-            </w:tcMar>
-          </w:tcPr>
-          <w:p>
-            <w:pPr>
-              <w:spacing w:after="0"/>
-            </w:pPr>
-            <w:r>
-              <w:rPr>
-                <w:rFonts w:ascii="Times New Roman" w:cs="Times New Roman" w:eastAsia="Times New Roman" w:hAnsi="Times New Roman"/>
-                <w:b w:val="false"/>
-                <w:bCs w:val="false"/>
-                <w:sz w:val="18"/>
-                <w:szCs w:val="18"/>
-              </w:rPr>
-              <w:t xml:space="preserve">20</w:t>
-            </w:r>
-          </w:p>
-        </w:tc>
-        <w:tc>
-          <w:tcPr>
-            <w:tcW w:type="dxa" w:w="900"/>
-            <w:tcBorders>
-              <w:top w:val="single" w:color="999999" w:sz="1"/>
-              <w:left w:val="single" w:color="999999" w:sz="1"/>
-              <w:bottom w:val="single" w:color="999999" w:sz="1"/>
-              <w:right w:val="single" w:color="999999" w:sz="1"/>
-            </w:tcBorders>
-            <w:tcMar>
-              <w:top w:type="dxa" w:w="60"/>
-              <w:left w:type="dxa" w:w="100"/>
-              <w:bottom w:type="dxa" w:w="60"/>
-              <w:right w:type="dxa" w:w="100"/>
-            </w:tcMar>
-          </w:tcPr>
-          <w:p>
-            <w:pPr>
-              <w:spacing w:after="0"/>
-            </w:pPr>
-            <w:r>
-              <w:rPr>
-                <w:rFonts w:ascii="Times New Roman" w:cs="Times New Roman" w:eastAsia="Times New Roman" w:hAnsi="Times New Roman"/>
-                <w:b w:val="false"/>
-                <w:bCs w:val="false"/>
-                <w:sz w:val="18"/>
-                <w:szCs w:val="18"/>
-              </w:rPr>
-              <w:t xml:space="preserve">0.05</w:t>
-            </w:r>
-          </w:p>
-        </w:tc>
-        <w:tc>
-          <w:tcPr>
-            <w:tcW w:type="dxa" w:w="2426"/>
-            <w:tcBorders>
-              <w:top w:val="single" w:color="999999" w:sz="1"/>
-              <w:left w:val="single" w:color="999999" w:sz="1"/>
-              <w:bottom w:val="single" w:color="999999" w:sz="1"/>
-              <w:right w:val="single" w:color="999999" w:sz="1"/>
-            </w:tcBorders>
-            <w:tcMar>
-              <w:top w:type="dxa" w:w="60"/>
-              <w:left w:type="dxa" w:w="100"/>
-              <w:bottom w:type="dxa" w:w="60"/>
-              <w:right w:type="dxa" w:w="100"/>
-            </w:tcMar>
-          </w:tcPr>
-          <w:p>
-            <w:pPr>
-              <w:spacing w:after="0"/>
-            </w:pPr>
-            <w:r>
-              <w:rPr>
-                <w:rFonts w:ascii="Times New Roman" w:cs="Times New Roman" w:eastAsia="Times New Roman" w:hAnsi="Times New Roman"/>
-                <w:b w:val="false"/>
-                <w:bCs w:val="false"/>
-                <w:sz w:val="18"/>
-                <w:szCs w:val="18"/>
-              </w:rPr>
-              <w:t xml:space="preserve">Lower</w:t>
+            <w:tcW w:type="dxa" w:w="1500"/>
+            <w:tcBorders>
+              <w:top w:val="single" w:color="999999" w:sz="1"/>
+              <w:left w:val="single" w:color="999999" w:sz="1"/>
+              <w:bottom w:val="single" w:color="999999" w:sz="1"/>
+              <w:right w:val="single" w:color="999999" w:sz="1"/>
+            </w:tcBorders>
+            <w:tcMar>
+              <w:top w:type="dxa" w:w="60"/>
+              <w:left w:type="dxa" w:w="100"/>
+              <w:bottom w:type="dxa" w:w="60"/>
+              <w:right w:type="dxa" w:w="100"/>
+            </w:tcMar>
+          </w:tcPr>
+          <w:p>
+            <w:pPr>
+              <w:spacing w:after="0"/>
+            </w:pPr>
+            <w:r>
+              <w:rPr>
+                <w:rFonts w:ascii="Times New Roman" w:cs="Times New Roman" w:eastAsia="Times New Roman" w:hAnsi="Times New Roman"/>
+                <w:b w:val="false"/>
+                <w:bCs w:val="false"/>
+                <w:sz w:val="18"/>
+                <w:szCs w:val="18"/>
+              </w:rPr>
+              <w:t xml:space="preserve">24 k_B T ln 2</w:t>
+            </w:r>
+          </w:p>
+        </w:tc>
+        <w:tc>
+          <w:tcPr>
+            <w:tcW w:type="dxa" w:w="1126"/>
+            <w:tcBorders>
+              <w:top w:val="single" w:color="999999" w:sz="1"/>
+              <w:left w:val="single" w:color="999999" w:sz="1"/>
+              <w:bottom w:val="single" w:color="999999" w:sz="1"/>
+              <w:right w:val="single" w:color="999999" w:sz="1"/>
+            </w:tcBorders>
+            <w:tcMar>
+              <w:top w:type="dxa" w:w="60"/>
+              <w:left w:type="dxa" w:w="100"/>
+              <w:bottom w:type="dxa" w:w="60"/>
+              <w:right w:type="dxa" w:w="100"/>
+            </w:tcMar>
+          </w:tcPr>
+          <w:p>
+            <w:pPr>
+              <w:spacing w:after="0"/>
+            </w:pPr>
+            <w:r>
+              <w:rPr>
+                <w:rFonts w:ascii="Times New Roman" w:cs="Times New Roman" w:eastAsia="Times New Roman" w:hAnsi="Times New Roman"/>
+                <w:b w:val="false"/>
+                <w:bCs w:val="false"/>
+                <w:sz w:val="18"/>
+                <w:szCs w:val="18"/>
+              </w:rPr>
+              <w:t xml:space="preserve">0.0417</w:t>
+            </w:r>
+          </w:p>
+        </w:tc>
+        <w:tc>
+          <w:tcPr>
+            <w:tcW w:type="dxa" w:w="1100"/>
+            <w:tcBorders>
+              <w:top w:val="single" w:color="999999" w:sz="1"/>
+              <w:left w:val="single" w:color="999999" w:sz="1"/>
+              <w:bottom w:val="single" w:color="999999" w:sz="1"/>
+              <w:right w:val="single" w:color="999999" w:sz="1"/>
+            </w:tcBorders>
+            <w:tcMar>
+              <w:top w:type="dxa" w:w="60"/>
+              <w:left w:type="dxa" w:w="100"/>
+              <w:bottom w:type="dxa" w:w="60"/>
+              <w:right w:type="dxa" w:w="100"/>
+            </w:tcMar>
+          </w:tcPr>
+          <w:p>
+            <w:pPr>
+              <w:spacing w:after="0"/>
+            </w:pPr>
+            <w:r>
+              <w:rPr>
+                <w:rFonts w:ascii="Times New Roman" w:cs="Times New Roman" w:eastAsia="Times New Roman" w:hAnsi="Times New Roman"/>
+                <w:b w:val="false"/>
+                <w:bCs w:val="false"/>
+                <w:sz w:val="18"/>
+                <w:szCs w:val="18"/>
+              </w:rPr>
+              <w:t xml:space="preserve">0.54</w:t>
+            </w:r>
+          </w:p>
+        </w:tc>
+        <w:tc>
+          <w:tcPr>
+            <w:tcW w:type="dxa" w:w="1100"/>
+            <w:tcBorders>
+              <w:top w:val="single" w:color="999999" w:sz="1"/>
+              <w:left w:val="single" w:color="999999" w:sz="1"/>
+              <w:bottom w:val="single" w:color="999999" w:sz="1"/>
+              <w:right w:val="single" w:color="999999" w:sz="1"/>
+            </w:tcBorders>
+            <w:tcMar>
+              <w:top w:type="dxa" w:w="60"/>
+              <w:left w:type="dxa" w:w="100"/>
+              <w:bottom w:type="dxa" w:w="60"/>
+              <w:right w:type="dxa" w:w="100"/>
+            </w:tcMar>
+          </w:tcPr>
+          <w:p>
+            <w:pPr>
+              <w:spacing w:after="0"/>
+            </w:pPr>
+            <w:r>
+              <w:rPr>
+                <w:rFonts w:ascii="Times New Roman" w:cs="Times New Roman" w:eastAsia="Times New Roman" w:hAnsi="Times New Roman"/>
+                <w:b w:val="false"/>
+                <w:bCs w:val="false"/>
+                <w:sz w:val="18"/>
+                <w:szCs w:val="18"/>
+              </w:rPr>
+              <w:t xml:space="preserve">1.00</w:t>
             </w:r>
           </w:p>
         </w:tc>
@@ -1664,7 +1788,7 @@
       <w:tr>
         <w:tc>
           <w:tcPr>
-            <w:tcW w:type="dxa" w:w="1800"/>
+            <w:tcW w:type="dxa" w:w="1600"/>
             <w:tcBorders>
               <w:top w:val="single" w:color="999999" w:sz="1"/>
               <w:left w:val="single" w:color="999999" w:sz="1"/>
@@ -1696,38 +1820,6 @@
         </w:tc>
         <w:tc>
           <w:tcPr>
-            <w:tcW w:type="dxa" w:w="2200"/>
-            <w:tcBorders>
-              <w:top w:val="single" w:color="999999" w:sz="1"/>
-              <w:left w:val="single" w:color="999999" w:sz="1"/>
-              <w:bottom w:val="single" w:color="999999" w:sz="1"/>
-              <w:right w:val="single" w:color="999999" w:sz="1"/>
-            </w:tcBorders>
-            <w:tcMar>
-              <w:top w:type="dxa" w:w="60"/>
-              <w:left w:type="dxa" w:w="100"/>
-              <w:bottom w:type="dxa" w:w="60"/>
-              <w:right w:type="dxa" w:w="100"/>
-            </w:tcMar>
-          </w:tcPr>
-          <w:p>
-            <w:pPr>
-              <w:spacing w:after="0"/>
-            </w:pPr>
-            <w:r>
-              <w:rPr>
-                <w:rFonts w:ascii="Times New Roman" w:cs="Times New Roman" w:eastAsia="Times New Roman" w:hAnsi="Times New Roman"/>
-                <w:b w:val="false"/>
-                <w:bCs w:val="false"/>
-                <w:sz w:val="18"/>
-                <w:szCs w:val="18"/>
-              </w:rPr>
-              <w:t xml:space="preserve">Tracks nuisance bit n only</w:t>
-            </w:r>
-          </w:p>
-        </w:tc>
-        <w:tc>
-          <w:tcPr>
             <w:tcW w:type="dxa" w:w="800"/>
             <w:tcBorders>
               <w:top w:val="single" w:color="999999" w:sz="1"/>
@@ -1754,45 +1846,109 @@
                 <w:sz w:val="18"/>
                 <w:szCs w:val="18"/>
               </w:rPr>
+              <w:t xml:space="preserve">1 bit</w:t>
+            </w:r>
+          </w:p>
+        </w:tc>
+        <w:tc>
+          <w:tcPr>
+            <w:tcW w:type="dxa" w:w="800"/>
+            <w:tcBorders>
+              <w:top w:val="single" w:color="999999" w:sz="1"/>
+              <w:left w:val="single" w:color="999999" w:sz="1"/>
+              <w:bottom w:val="single" w:color="999999" w:sz="1"/>
+              <w:right w:val="single" w:color="999999" w:sz="1"/>
+            </w:tcBorders>
+            <w:tcMar>
+              <w:top w:type="dxa" w:w="60"/>
+              <w:left w:type="dxa" w:w="100"/>
+              <w:bottom w:type="dxa" w:w="60"/>
+              <w:right w:type="dxa" w:w="100"/>
+            </w:tcMar>
+          </w:tcPr>
+          <w:p>
+            <w:pPr>
+              <w:spacing w:after="0"/>
+            </w:pPr>
+            <w:r>
+              <w:rPr>
+                <w:rFonts w:ascii="Times New Roman" w:cs="Times New Roman" w:eastAsia="Times New Roman" w:hAnsi="Times New Roman"/>
+                <w:b w:val="false"/>
+                <w:bCs w:val="false"/>
+                <w:sz w:val="18"/>
+                <w:szCs w:val="18"/>
+              </w:rPr>
               <w:t xml:space="preserve">0 bits</w:t>
             </w:r>
           </w:p>
         </w:tc>
         <w:tc>
           <w:tcPr>
-            <w:tcW w:type="dxa" w:w="900"/>
-            <w:tcBorders>
-              <w:top w:val="single" w:color="999999" w:sz="1"/>
-              <w:left w:val="single" w:color="999999" w:sz="1"/>
-              <w:bottom w:val="single" w:color="999999" w:sz="1"/>
-              <w:right w:val="single" w:color="999999" w:sz="1"/>
-            </w:tcBorders>
-            <w:tcMar>
-              <w:top w:type="dxa" w:w="60"/>
-              <w:left w:type="dxa" w:w="100"/>
-              <w:bottom w:type="dxa" w:w="60"/>
-              <w:right w:type="dxa" w:w="100"/>
-            </w:tcMar>
-          </w:tcPr>
-          <w:p>
-            <w:pPr>
-              <w:spacing w:after="0"/>
-            </w:pPr>
-            <w:r>
-              <w:rPr>
-                <w:rFonts w:ascii="Times New Roman" w:cs="Times New Roman" w:eastAsia="Times New Roman" w:hAnsi="Times New Roman"/>
-                <w:b w:val="false"/>
-                <w:bCs w:val="false"/>
-                <w:sz w:val="18"/>
-                <w:szCs w:val="18"/>
-              </w:rPr>
-              <w:t xml:space="preserve">10</w:t>
-            </w:r>
-          </w:p>
-        </w:tc>
-        <w:tc>
-          <w:tcPr>
-            <w:tcW w:type="dxa" w:w="900"/>
+            <w:tcW w:type="dxa" w:w="1500"/>
+            <w:tcBorders>
+              <w:top w:val="single" w:color="999999" w:sz="1"/>
+              <w:left w:val="single" w:color="999999" w:sz="1"/>
+              <w:bottom w:val="single" w:color="999999" w:sz="1"/>
+              <w:right w:val="single" w:color="999999" w:sz="1"/>
+            </w:tcBorders>
+            <w:tcMar>
+              <w:top w:type="dxa" w:w="60"/>
+              <w:left w:type="dxa" w:w="100"/>
+              <w:bottom w:type="dxa" w:w="60"/>
+              <w:right w:type="dxa" w:w="100"/>
+            </w:tcMar>
+          </w:tcPr>
+          <w:p>
+            <w:pPr>
+              <w:spacing w:after="0"/>
+            </w:pPr>
+            <w:r>
+              <w:rPr>
+                <w:rFonts w:ascii="Times New Roman" w:cs="Times New Roman" w:eastAsia="Times New Roman" w:hAnsi="Times New Roman"/>
+                <w:b w:val="false"/>
+                <w:bCs w:val="false"/>
+                <w:sz w:val="18"/>
+                <w:szCs w:val="18"/>
+              </w:rPr>
+              <w:t xml:space="preserve">16 k_B T ln 2</w:t>
+            </w:r>
+          </w:p>
+        </w:tc>
+        <w:tc>
+          <w:tcPr>
+            <w:tcW w:type="dxa" w:w="1126"/>
+            <w:tcBorders>
+              <w:top w:val="single" w:color="999999" w:sz="1"/>
+              <w:left w:val="single" w:color="999999" w:sz="1"/>
+              <w:bottom w:val="single" w:color="999999" w:sz="1"/>
+              <w:right w:val="single" w:color="999999" w:sz="1"/>
+            </w:tcBorders>
+            <w:tcMar>
+              <w:top w:type="dxa" w:w="60"/>
+              <w:left w:type="dxa" w:w="100"/>
+              <w:bottom w:type="dxa" w:w="60"/>
+              <w:right w:type="dxa" w:w="100"/>
+            </w:tcMar>
+          </w:tcPr>
+          <w:p>
+            <w:pPr>
+              <w:spacing w:after="0"/>
+            </w:pPr>
+            <w:r>
+              <w:rPr>
+                <w:rFonts w:ascii="Times New Roman" w:cs="Times New Roman" w:eastAsia="Times New Roman" w:hAnsi="Times New Roman"/>
+                <w:b w:val="false"/>
+                <w:bCs w:val="false"/>
+                <w:sz w:val="18"/>
+                <w:szCs w:val="18"/>
+              </w:rPr>
+              <w:t xml:space="preserve">0.0000</w:t>
+            </w:r>
+          </w:p>
+        </w:tc>
+        <w:tc>
+          <w:tcPr>
+            <w:tcW w:type="dxa" w:w="1100"/>
             <w:tcBorders>
               <w:top w:val="single" w:color="999999" w:sz="1"/>
               <w:left w:val="single" w:color="999999" w:sz="1"/>
@@ -1824,33 +1980,33 @@
         </w:tc>
         <w:tc>
           <w:tcPr>
-            <w:tcW w:type="dxa" w:w="2426"/>
-            <w:tcBorders>
-              <w:top w:val="single" w:color="999999" w:sz="1"/>
-              <w:left w:val="single" w:color="999999" w:sz="1"/>
-              <w:bottom w:val="single" w:color="999999" w:sz="1"/>
-              <w:right w:val="single" w:color="999999" w:sz="1"/>
-            </w:tcBorders>
-            <w:tcMar>
-              <w:top w:type="dxa" w:w="60"/>
-              <w:left w:type="dxa" w:w="100"/>
-              <w:bottom w:type="dxa" w:w="60"/>
-              <w:right w:type="dxa" w:w="100"/>
-            </w:tcMar>
-          </w:tcPr>
-          <w:p>
-            <w:pPr>
-              <w:spacing w:after="0"/>
-            </w:pPr>
-            <w:r>
-              <w:rPr>
-                <w:rFonts w:ascii="Times New Roman" w:cs="Times New Roman" w:eastAsia="Times New Roman" w:hAnsi="Times New Roman"/>
-                <w:b w:val="false"/>
-                <w:bCs w:val="false"/>
-                <w:sz w:val="18"/>
-                <w:szCs w:val="18"/>
-              </w:rPr>
-              <w:t xml:space="preserve">Near zero</w:t>
+            <w:tcW w:type="dxa" w:w="1100"/>
+            <w:tcBorders>
+              <w:top w:val="single" w:color="999999" w:sz="1"/>
+              <w:left w:val="single" w:color="999999" w:sz="1"/>
+              <w:bottom w:val="single" w:color="999999" w:sz="1"/>
+              <w:right w:val="single" w:color="999999" w:sz="1"/>
+            </w:tcBorders>
+            <w:tcMar>
+              <w:top w:type="dxa" w:w="60"/>
+              <w:left w:type="dxa" w:w="100"/>
+              <w:bottom w:type="dxa" w:w="60"/>
+              <w:right w:type="dxa" w:w="100"/>
+            </w:tcMar>
+          </w:tcPr>
+          <w:p>
+            <w:pPr>
+              <w:spacing w:after="0"/>
+            </w:pPr>
+            <w:r>
+              <w:rPr>
+                <w:rFonts w:ascii="Times New Roman" w:cs="Times New Roman" w:eastAsia="Times New Roman" w:hAnsi="Times New Roman"/>
+                <w:b w:val="false"/>
+                <w:bCs w:val="false"/>
+                <w:sz w:val="18"/>
+                <w:szCs w:val="18"/>
+              </w:rPr>
+              <w:t xml:space="preserve">0.50</w:t>
             </w:r>
           </w:p>
         </w:tc>
@@ -1879,7 +2035,7 @@
           <w:sz w:val="20"/>
           <w:szCs w:val="20"/>
         </w:rPr>
-        <w:t xml:space="preserve">A raw information metric would credit the lookup-table agent for storing more structure than the latent-rule learner. A narrow benchmark score could tie the first two agents on the training distribution. The present proposal counts only the part of internal structure that is relevant to viability and then evaluates whether that useful structure was acquired efficiently and can be deployed broadly. On that basis the latent-rule learner dominates the lookup-table memoriser in efficiency and adaptive reach, while the nuisance memoriser drops out entirely.</w:t>
+        <w:t xml:space="preserve">Several observations follow. First, C_u correctly identifies the useful information: both the rule learner and the lookup table carry one bit about Z, but the lookup table wastes an additional bit on nuisance structure. A raw information metric would credit the lookup table for storing more total structure. Second, the rule learner is 50% more efficient (I*_eff = 0.0625 vs. 0.0417) because it avoids the addressing overhead of a larger memory. Third, all three agents can be tied or separated on training-distribution accuracy, but only C_u and A jointly distinguish the rule learner as the agent with genuinely useful structure. Fourth, the noise memoriser stores one bit and dissipates the same energy as the rule learner, yet C_u = 0—it has learned nothing about viability. The framework captures this cleanly: useful structure is not raw stored information but relevance-filtered information about Z^V.</w:t>
       </w:r>
     </w:p>
     <w:p>
@@ -3633,6 +3789,174 @@
           <w:szCs w:val="20"/>
         </w:rPr>
         <w:t xml:space="preserve"/>
+      </w:r>
+    </w:p>
+    <w:p>
+      <w:pPr>
+        <w:spacing w:after="120" w:line="276"/>
+      </w:pPr>
+      <w:r>
+        <w:rPr>
+          <w:rFonts w:ascii="Times New Roman" w:cs="Times New Roman" w:eastAsia="Times New Roman" w:hAnsi="Times New Roman"/>
+          <w:sz w:val="20"/>
+          <w:szCs w:val="20"/>
+        </w:rPr>
+        <w:t xml:space="preserve"/>
+      </w:r>
+    </w:p>
+    <w:p>
+      <w:pPr>
+        <w:pStyle w:val="Heading2"/>
+        <w:spacing w:after="100" w:before="200"/>
+      </w:pPr>
+      <w:r>
+        <w:rPr>
+          <w:rFonts w:ascii="Times New Roman" w:cs="Times New Roman" w:eastAsia="Times New Roman" w:hAnsi="Times New Roman"/>
+          <w:b/>
+          <w:bCs/>
+          <w:sz w:val="22"/>
+          <w:szCs w:val="22"/>
+        </w:rPr>
+        <w:t xml:space="preserve">Author Contributions</w:t>
+      </w:r>
+    </w:p>
+    <w:p>
+      <w:pPr>
+        <w:spacing w:after="120" w:line="276"/>
+      </w:pPr>
+      <w:r>
+        <w:rPr>
+          <w:rFonts w:ascii="Times New Roman" w:cs="Times New Roman" w:eastAsia="Times New Roman" w:hAnsi="Times New Roman"/>
+          <w:sz w:val="20"/>
+          <w:szCs w:val="20"/>
+        </w:rPr>
+        <w:t xml:space="preserve">B.D. conceived the framework, conducted the literature review, performed the computations, and wrote the manuscript.</w:t>
+      </w:r>
+    </w:p>
+    <w:p>
+      <w:pPr>
+        <w:spacing w:after="120" w:line="276"/>
+      </w:pPr>
+      <w:r>
+        <w:rPr>
+          <w:rFonts w:ascii="Times New Roman" w:cs="Times New Roman" w:eastAsia="Times New Roman" w:hAnsi="Times New Roman"/>
+          <w:sz w:val="20"/>
+          <w:szCs w:val="20"/>
+        </w:rPr>
+        <w:t xml:space="preserve"/>
+      </w:r>
+    </w:p>
+    <w:p>
+      <w:pPr>
+        <w:pStyle w:val="Heading2"/>
+        <w:spacing w:after="100" w:before="200"/>
+      </w:pPr>
+      <w:r>
+        <w:rPr>
+          <w:rFonts w:ascii="Times New Roman" w:cs="Times New Roman" w:eastAsia="Times New Roman" w:hAnsi="Times New Roman"/>
+          <w:b/>
+          <w:bCs/>
+          <w:sz w:val="22"/>
+          <w:szCs w:val="22"/>
+        </w:rPr>
+        <w:t xml:space="preserve">Funding</w:t>
+      </w:r>
+    </w:p>
+    <w:p>
+      <w:pPr>
+        <w:spacing w:after="120" w:line="276"/>
+      </w:pPr>
+      <w:r>
+        <w:rPr>
+          <w:rFonts w:ascii="Times New Roman" w:cs="Times New Roman" w:eastAsia="Times New Roman" w:hAnsi="Times New Roman"/>
+          <w:sz w:val="20"/>
+          <w:szCs w:val="20"/>
+        </w:rPr>
+        <w:t xml:space="preserve">This research received no external funding.</w:t>
+      </w:r>
+    </w:p>
+    <w:p>
+      <w:pPr>
+        <w:spacing w:after="120" w:line="276"/>
+      </w:pPr>
+      <w:r>
+        <w:rPr>
+          <w:rFonts w:ascii="Times New Roman" w:cs="Times New Roman" w:eastAsia="Times New Roman" w:hAnsi="Times New Roman"/>
+          <w:sz w:val="20"/>
+          <w:szCs w:val="20"/>
+        </w:rPr>
+        <w:t xml:space="preserve"/>
+      </w:r>
+    </w:p>
+    <w:p>
+      <w:pPr>
+        <w:pStyle w:val="Heading2"/>
+        <w:spacing w:after="100" w:before="200"/>
+      </w:pPr>
+      <w:r>
+        <w:rPr>
+          <w:rFonts w:ascii="Times New Roman" w:cs="Times New Roman" w:eastAsia="Times New Roman" w:hAnsi="Times New Roman"/>
+          <w:b/>
+          <w:bCs/>
+          <w:sz w:val="22"/>
+          <w:szCs w:val="22"/>
+        </w:rPr>
+        <w:t xml:space="preserve">Data Availability Statement</w:t>
+      </w:r>
+    </w:p>
+    <w:p>
+      <w:pPr>
+        <w:spacing w:after="120" w:line="276"/>
+      </w:pPr>
+      <w:r>
+        <w:rPr>
+          <w:rFonts w:ascii="Times New Roman" w:cs="Times New Roman" w:eastAsia="Times New Roman" w:hAnsi="Times New Roman"/>
+          <w:sz w:val="20"/>
+          <w:szCs w:val="20"/>
+        </w:rPr>
+        <w:t xml:space="preserve">The computation code used to generate Table 1 is available at https://github.com/199-biotechnologies/fti (compute_cu.py).</w:t>
+      </w:r>
+    </w:p>
+    <w:p>
+      <w:pPr>
+        <w:spacing w:after="120" w:line="276"/>
+      </w:pPr>
+      <w:r>
+        <w:rPr>
+          <w:rFonts w:ascii="Times New Roman" w:cs="Times New Roman" w:eastAsia="Times New Roman" w:hAnsi="Times New Roman"/>
+          <w:sz w:val="20"/>
+          <w:szCs w:val="20"/>
+        </w:rPr>
+        <w:t xml:space="preserve"/>
+      </w:r>
+    </w:p>
+    <w:p>
+      <w:pPr>
+        <w:pStyle w:val="Heading2"/>
+        <w:spacing w:after="100" w:before="200"/>
+      </w:pPr>
+      <w:r>
+        <w:rPr>
+          <w:rFonts w:ascii="Times New Roman" w:cs="Times New Roman" w:eastAsia="Times New Roman" w:hAnsi="Times New Roman"/>
+          <w:b/>
+          <w:bCs/>
+          <w:sz w:val="22"/>
+          <w:szCs w:val="22"/>
+        </w:rPr>
+        <w:t xml:space="preserve">Conflicts of Interest</w:t>
+      </w:r>
+    </w:p>
+    <w:p>
+      <w:pPr>
+        <w:spacing w:after="120" w:line="276"/>
+      </w:pPr>
+      <w:r>
+        <w:rPr>
+          <w:rFonts w:ascii="Times New Roman" w:cs="Times New Roman" w:eastAsia="Times New Roman" w:hAnsi="Times New Roman"/>
+          <w:sz w:val="20"/>
+          <w:szCs w:val="20"/>
+        </w:rPr>
+        <w:t xml:space="preserve">The author is the founder of 199 Biotechnologies (SG) Pte Ltd, which develops AI infrastructure tools. The research was conducted independently and the company had no role in the design or writing of this work.</w:t>
       </w:r>
     </w:p>
     <w:p>

</xml_diff>

<commit_message>
Fix docx: add joint distribution derivations, align refs to PDF
Consistency checker found 2 high-severity issues:
1. Pre-Table-1 text was missing per-agent joint distribution
   derivations (P(M,Z) bullet points). Now matches Typst source.
2. Reference list [13]-[25] was stale from earlier version.
   Now 23 refs matching PDF exactly:
   [13]=Kolchinsky, [14]=Tishby (was Bialek, Crutchfield).
   Added DOIs where available.

Also updated Table 1 caption to include n_max range and code ref.
Rebuilt GPT-Pro review package with corrected docx.
</commit_message>
<xml_diff>
--- a/Intelligence_as_Useful_Structure.docx
+++ b/Intelligence_as_Useful_Structure.docx
@@ -1038,7 +1038,76 @@
           <w:sz w:val="20"/>
           <w:szCs w:val="20"/>
         </w:rPr>
-        <w:t xml:space="preserve">We compute C_u = I(M; Z) exactly by constructing the joint distribution P(M, Z) for each agent, where Z = z is the viability-relevant variable. Because z and n are independent and uniform, the rule learner and lookup table both achieve C_u = 1 bit (all information about Z is preserved), while the noise memoriser achieves C_u = 0 bits (M is independent of Z). The lookup table stores H(M) = 2 bits total—one bit of nuisance is stored without increasing useful structure.</w:t>
+        <w:t xml:space="preserve">We compute C_u = I(M; Z) exactly by constructing the joint distribution P(M, Z) for each agent, where Z = z is the viability-relevant variable. Because z and n are independent and uniform, the joint distributions are:</w:t>
+      </w:r>
+    </w:p>
+    <w:p>
+      <w:pPr>
+        <w:spacing w:after="120" w:line="276"/>
+      </w:pPr>
+      <w:r>
+        <w:rPr>
+          <w:rFonts w:ascii="Times New Roman" w:cs="Times New Roman" w:eastAsia="Times New Roman" w:hAnsi="Times New Roman"/>
+          <w:i/>
+          <w:iCs/>
+          <w:sz w:val="20"/>
+          <w:szCs w:val="20"/>
+        </w:rPr>
+        <w:t xml:space="preserve">Rule learner: </w:t>
+      </w:r>
+      <w:r>
+        <w:rPr>
+          <w:rFonts w:ascii="Times New Roman" w:cs="Times New Roman" w:eastAsia="Times New Roman" w:hAnsi="Times New Roman"/>
+          <w:sz w:val="20"/>
+          <w:szCs w:val="20"/>
+        </w:rPr>
+        <w:t xml:space="preserve">P(M=i, Z=j) = 1/2 if i = j, else 0. This gives I(M; Z) = H(Z) = 1 bit.</w:t>
+      </w:r>
+    </w:p>
+    <w:p>
+      <w:pPr>
+        <w:spacing w:after="120" w:line="276"/>
+      </w:pPr>
+      <w:r>
+        <w:rPr>
+          <w:rFonts w:ascii="Times New Roman" w:cs="Times New Roman" w:eastAsia="Times New Roman" w:hAnsi="Times New Roman"/>
+          <w:i/>
+          <w:iCs/>
+          <w:sz w:val="20"/>
+          <w:szCs w:val="20"/>
+        </w:rPr>
+        <w:t xml:space="preserve">Lookup table: </w:t>
+      </w:r>
+      <w:r>
+        <w:rPr>
+          <w:rFonts w:ascii="Times New Roman" w:cs="Times New Roman" w:eastAsia="Times New Roman" w:hAnsi="Times New Roman"/>
+          <w:sz w:val="20"/>
+          <w:szCs w:val="20"/>
+        </w:rPr>
+        <w:t xml:space="preserve">P(M=(i,k), Z=j) = 1/4 if i = j, else 0. Again I(M; Z) = 1 bit, but H(M) = 2 bits — one bit of nuisance is stored without increasing useful structure.</w:t>
+      </w:r>
+    </w:p>
+    <w:p>
+      <w:pPr>
+        <w:spacing w:after="120" w:line="276"/>
+      </w:pPr>
+      <w:r>
+        <w:rPr>
+          <w:rFonts w:ascii="Times New Roman" w:cs="Times New Roman" w:eastAsia="Times New Roman" w:hAnsi="Times New Roman"/>
+          <w:i/>
+          <w:iCs/>
+          <w:sz w:val="20"/>
+          <w:szCs w:val="20"/>
+        </w:rPr>
+        <w:t xml:space="preserve">Noise memoriser: </w:t>
+      </w:r>
+      <w:r>
+        <w:rPr>
+          <w:rFonts w:ascii="Times New Roman" w:cs="Times New Roman" w:eastAsia="Times New Roman" w:hAnsi="Times New Roman"/>
+          <w:sz w:val="20"/>
+          <w:szCs w:val="20"/>
+        </w:rPr>
+        <w:t xml:space="preserve">P(M=k, Z=j) = 1/4 for all k, j, so I(M; Z) = 0.</w:t>
       </w:r>
     </w:p>
     <w:p>
@@ -1076,7 +1145,7 @@
           <w:sz w:val="20"/>
           <w:szCs w:val="20"/>
         </w:rPr>
-        <w:t xml:space="preserve">Exact toy calculation. C_u computed analytically from joint distributions. W_diss counted at the Landauer floor (k_B T ln 2 per bit erasure, T = 300 K). Adaptive reach A estimated over 1000 environments with varying nuisance dimensionality.</w:t>
+        <w:t xml:space="preserve">Exact toy calculation. C_u is computed analytically from joint distributions. W_diss is counted at the Landauer floor (k_B T ln 2 per bit erasure, T = 300 K). Adaptive reach A is estimated over 1000 environments with varying nuisance dimensionality (n_max ∈ {1, 2, 3, 4}, viability threshold θ = 0.8). Code: compute_cu.py.</w:t>
       </w:r>
     </w:p>
     <w:tbl>
@@ -3990,319 +4059,293 @@
           <w:sz w:val="20"/>
           <w:szCs w:val="20"/>
         </w:rPr>
-        <w:t xml:space="preserve">[1] Legg, S.; Hutter, M. Universal intelligence: A definition of machine intelligence. Minds and Machines 2007, 17, 391–444.</w:t>
-      </w:r>
-    </w:p>
-    <w:p>
-      <w:pPr>
-        <w:spacing w:after="120" w:line="276"/>
-      </w:pPr>
-      <w:r>
-        <w:rPr>
-          <w:rFonts w:ascii="Times New Roman" w:cs="Times New Roman" w:eastAsia="Times New Roman" w:hAnsi="Times New Roman"/>
-          <w:sz w:val="20"/>
-          <w:szCs w:val="20"/>
-        </w:rPr>
-        <w:t xml:space="preserve">[2] Chollet, F. On the measure of intelligence. arXiv 2019, 1911.01547.</w:t>
-      </w:r>
-    </w:p>
-    <w:p>
-      <w:pPr>
-        <w:spacing w:after="120" w:line="276"/>
-      </w:pPr>
-      <w:r>
-        <w:rPr>
-          <w:rFonts w:ascii="Times New Roman" w:cs="Times New Roman" w:eastAsia="Times New Roman" w:hAnsi="Times New Roman"/>
-          <w:sz w:val="20"/>
-          <w:szCs w:val="20"/>
-        </w:rPr>
-        <w:t xml:space="preserve">[3] Gignac, G.E.; Szodorai, E.T. Defining intelligence: Bridging the gap between human and artificial perspectives. Intelligence 2024, 104, 101832.</w:t>
-      </w:r>
-    </w:p>
-    <w:p>
-      <w:pPr>
-        <w:spacing w:after="120" w:line="276"/>
-      </w:pPr>
-      <w:r>
-        <w:rPr>
-          <w:rFonts w:ascii="Times New Roman" w:cs="Times New Roman" w:eastAsia="Times New Roman" w:hAnsi="Times New Roman"/>
-          <w:sz w:val="20"/>
-          <w:szCs w:val="20"/>
-        </w:rPr>
-        <w:t xml:space="preserve">[4] Sternberg, R.J. What is intelligence, really? The futile search for a Holy Grail. Learning and Individual Differences 2024, 116, 102568.</w:t>
-      </w:r>
-    </w:p>
-    <w:p>
-      <w:pPr>
-        <w:spacing w:after="120" w:line="276"/>
-      </w:pPr>
-      <w:r>
-        <w:rPr>
-          <w:rFonts w:ascii="Times New Roman" w:cs="Times New Roman" w:eastAsia="Times New Roman" w:hAnsi="Times New Roman"/>
-          <w:sz w:val="20"/>
-          <w:szCs w:val="20"/>
-        </w:rPr>
-        <w:t xml:space="preserve">[5] Friston, K. The free-energy principle: A unified brain theory? Nature Reviews Neuroscience 2010, 11, 127–138.</w:t>
-      </w:r>
-    </w:p>
-    <w:p>
-      <w:pPr>
-        <w:spacing w:after="120" w:line="276"/>
-      </w:pPr>
-      <w:r>
-        <w:rPr>
-          <w:rFonts w:ascii="Times New Roman" w:cs="Times New Roman" w:eastAsia="Times New Roman" w:hAnsi="Times New Roman"/>
-          <w:sz w:val="20"/>
-          <w:szCs w:val="20"/>
-        </w:rPr>
-        <w:t xml:space="preserve">[6] Ramstead, M.J.D. et al. On Bayesian mechanics: A physics of and by beliefs. Interface Focus 2023, 13, 20220029.</w:t>
-      </w:r>
-    </w:p>
-    <w:p>
-      <w:pPr>
-        <w:spacing w:after="120" w:line="276"/>
-      </w:pPr>
-      <w:r>
-        <w:rPr>
-          <w:rFonts w:ascii="Times New Roman" w:cs="Times New Roman" w:eastAsia="Times New Roman" w:hAnsi="Times New Roman"/>
-          <w:sz w:val="20"/>
-          <w:szCs w:val="20"/>
-        </w:rPr>
-        <w:t xml:space="preserve">[7] Pezzulo, G.; Parr, T.; Friston, K. Active inference as a theory of sentient behavior. Biological Psychology 2024, 186, 108741.</w:t>
-      </w:r>
-    </w:p>
-    <w:p>
-      <w:pPr>
-        <w:spacing w:after="120" w:line="276"/>
-      </w:pPr>
-      <w:r>
-        <w:rPr>
-          <w:rFonts w:ascii="Times New Roman" w:cs="Times New Roman" w:eastAsia="Times New Roman" w:hAnsi="Times New Roman"/>
-          <w:sz w:val="20"/>
-          <w:szCs w:val="20"/>
-        </w:rPr>
-        <w:t xml:space="preserve">[8] Pezzulo, G. et al. Generating meaning: Active inference and the scope and limits of passive AI. Trends in Cognitive Sciences 2024, 28, 97–112.</w:t>
-      </w:r>
-    </w:p>
-    <w:p>
-      <w:pPr>
-        <w:spacing w:after="120" w:line="276"/>
-      </w:pPr>
-      <w:r>
-        <w:rPr>
-          <w:rFonts w:ascii="Times New Roman" w:cs="Times New Roman" w:eastAsia="Times New Roman" w:hAnsi="Times New Roman"/>
-          <w:sz w:val="20"/>
-          <w:szCs w:val="20"/>
-        </w:rPr>
-        <w:t xml:space="preserve">[9] Landauer, R. Irreversibility and heat generation in the computing process. IBM Journal of Research and Development 1961, 5, 183–191.</w:t>
-      </w:r>
-    </w:p>
-    <w:p>
-      <w:pPr>
-        <w:spacing w:after="120" w:line="276"/>
-      </w:pPr>
-      <w:r>
-        <w:rPr>
-          <w:rFonts w:ascii="Times New Roman" w:cs="Times New Roman" w:eastAsia="Times New Roman" w:hAnsi="Times New Roman"/>
-          <w:sz w:val="20"/>
-          <w:szCs w:val="20"/>
-        </w:rPr>
-        <w:t xml:space="preserve">[10] Still, S. et al. Thermodynamics of prediction. Physical Review Letters 2012, 109, 120604.</w:t>
-      </w:r>
-    </w:p>
-    <w:p>
-      <w:pPr>
-        <w:spacing w:after="120" w:line="276"/>
-      </w:pPr>
-      <w:r>
-        <w:rPr>
-          <w:rFonts w:ascii="Times New Roman" w:cs="Times New Roman" w:eastAsia="Times New Roman" w:hAnsi="Times New Roman"/>
-          <w:sz w:val="20"/>
-          <w:szCs w:val="20"/>
-        </w:rPr>
-        <w:t xml:space="preserve">[11] England, J.L. Dissipative adaptation in driven self-assembly. Nature Nanotechnology 2015, 10, 919–923.</w:t>
-      </w:r>
-    </w:p>
-    <w:p>
-      <w:pPr>
-        <w:spacing w:after="120" w:line="276"/>
-      </w:pPr>
-      <w:r>
-        <w:rPr>
-          <w:rFonts w:ascii="Times New Roman" w:cs="Times New Roman" w:eastAsia="Times New Roman" w:hAnsi="Times New Roman"/>
-          <w:sz w:val="20"/>
-          <w:szCs w:val="20"/>
-        </w:rPr>
-        <w:t xml:space="preserve">[12] Ali, A. et al. Predictive coding is a consequence of energy efficiency in recurrent neural networks. Patterns 2022, 3, 100639.</w:t>
-      </w:r>
-    </w:p>
-    <w:p>
-      <w:pPr>
-        <w:spacing w:after="120" w:line="276"/>
-      </w:pPr>
-      <w:r>
-        <w:rPr>
-          <w:rFonts w:ascii="Times New Roman" w:cs="Times New Roman" w:eastAsia="Times New Roman" w:hAnsi="Times New Roman"/>
-          <w:sz w:val="20"/>
-          <w:szCs w:val="20"/>
-        </w:rPr>
-        <w:t xml:space="preserve">[13] Bialek, W.; Nemenman, I.; Tishby, N. Predictability, complexity, and learning. Neural Computation 2001, 13, 2409–2463.</w:t>
-      </w:r>
-    </w:p>
-    <w:p>
-      <w:pPr>
-        <w:spacing w:after="120" w:line="276"/>
-      </w:pPr>
-      <w:r>
-        <w:rPr>
-          <w:rFonts w:ascii="Times New Roman" w:cs="Times New Roman" w:eastAsia="Times New Roman" w:hAnsi="Times New Roman"/>
-          <w:sz w:val="20"/>
-          <w:szCs w:val="20"/>
-        </w:rPr>
-        <w:t xml:space="preserve">[14] Crutchfield, J.P.; Young, K. Inferring statistical complexity. Physical Review Letters 1989, 63, 105–108.</w:t>
-      </w:r>
-    </w:p>
-    <w:p>
-      <w:pPr>
-        <w:spacing w:after="120" w:line="276"/>
-      </w:pPr>
-      <w:r>
-        <w:rPr>
-          <w:rFonts w:ascii="Times New Roman" w:cs="Times New Roman" w:eastAsia="Times New Roman" w:hAnsi="Times New Roman"/>
-          <w:sz w:val="20"/>
-          <w:szCs w:val="20"/>
-        </w:rPr>
-        <w:t xml:space="preserve">[15] Kolchinsky, A.; Wolpert, D.H. Semantic information, autonomous agency and non-equilibrium statistical physics. Interface Focus 2018, 8, 20180041.</w:t>
-      </w:r>
-    </w:p>
-    <w:p>
-      <w:pPr>
-        <w:spacing w:after="120" w:line="276"/>
-      </w:pPr>
-      <w:r>
-        <w:rPr>
-          <w:rFonts w:ascii="Times New Roman" w:cs="Times New Roman" w:eastAsia="Times New Roman" w:hAnsi="Times New Roman"/>
-          <w:sz w:val="20"/>
-          <w:szCs w:val="20"/>
-        </w:rPr>
-        <w:t xml:space="preserve">[16] Tishby, N.; Pereira, F.C.; Bialek, W. The information bottleneck method. In Proceedings of the 37th Allerton Conference, 1999; pp. 368–377.</w:t>
-      </w:r>
-    </w:p>
-    <w:p>
-      <w:pPr>
-        <w:spacing w:after="120" w:line="276"/>
-      </w:pPr>
-      <w:r>
-        <w:rPr>
-          <w:rFonts w:ascii="Times New Roman" w:cs="Times New Roman" w:eastAsia="Times New Roman" w:hAnsi="Times New Roman"/>
-          <w:sz w:val="20"/>
-          <w:szCs w:val="20"/>
-        </w:rPr>
-        <w:t xml:space="preserve">[17] Klyubin, A.S.; Polani, D.; Nehaniv, C.L. All else being equal be empowered. In ECAL 2005; LNCS 3630; pp. 744–753.</w:t>
-      </w:r>
-    </w:p>
-    <w:p>
-      <w:pPr>
-        <w:spacing w:after="120" w:line="276"/>
-      </w:pPr>
-      <w:r>
-        <w:rPr>
-          <w:rFonts w:ascii="Times New Roman" w:cs="Times New Roman" w:eastAsia="Times New Roman" w:hAnsi="Times New Roman"/>
-          <w:sz w:val="20"/>
-          <w:szCs w:val="20"/>
-        </w:rPr>
-        <w:t xml:space="preserve">[18] Tiomkin, S. et al. Intrinsic motivation in dynamical control systems. PRX Life 2024, 2, 033009.</w:t>
-      </w:r>
-    </w:p>
-    <w:p>
-      <w:pPr>
-        <w:spacing w:after="120" w:line="276"/>
-      </w:pPr>
-      <w:r>
-        <w:rPr>
-          <w:rFonts w:ascii="Times New Roman" w:cs="Times New Roman" w:eastAsia="Times New Roman" w:hAnsi="Times New Roman"/>
-          <w:sz w:val="20"/>
-          <w:szCs w:val="20"/>
-        </w:rPr>
-        <w:t xml:space="preserve">[19] Kiefer, A.B. Intrinsic motivation as constrained entropy maximization. Entropy 2025, 27, 372.</w:t>
-      </w:r>
-    </w:p>
-    <w:p>
-      <w:pPr>
-        <w:spacing w:after="120" w:line="276"/>
-      </w:pPr>
-      <w:r>
-        <w:rPr>
-          <w:rFonts w:ascii="Times New Roman" w:cs="Times New Roman" w:eastAsia="Times New Roman" w:hAnsi="Times New Roman"/>
-          <w:sz w:val="20"/>
-          <w:szCs w:val="20"/>
-        </w:rPr>
-        <w:t xml:space="preserve">[20] Takahashi, K.; Hayashi, Y. Thermodynamic limits of physical intelligence. arXiv 2026, 2602.05463.</w:t>
-      </w:r>
-    </w:p>
-    <w:p>
-      <w:pPr>
-        <w:spacing w:after="120" w:line="276"/>
-      </w:pPr>
-      <w:r>
-        <w:rPr>
-          <w:rFonts w:ascii="Times New Roman" w:cs="Times New Roman" w:eastAsia="Times New Roman" w:hAnsi="Times New Roman"/>
-          <w:sz w:val="20"/>
-          <w:szCs w:val="20"/>
-        </w:rPr>
-        <w:t xml:space="preserve">[21] Fagan, P.D. Toward a physical theory of intelligence. arXiv 2025, 2601.00021.</w:t>
-      </w:r>
-    </w:p>
-    <w:p>
-      <w:pPr>
-        <w:spacing w:after="120" w:line="276"/>
-      </w:pPr>
-      <w:r>
-        <w:rPr>
-          <w:rFonts w:ascii="Times New Roman" w:cs="Times New Roman" w:eastAsia="Times New Roman" w:hAnsi="Times New Roman"/>
-          <w:sz w:val="20"/>
-          <w:szCs w:val="20"/>
-        </w:rPr>
-        <w:t xml:space="preserve">[22] Perrier, E. Watts-per-intelligence: Part I (energy efficiency). arXiv 2025, 2504.05328.</w:t>
-      </w:r>
-    </w:p>
-    <w:p>
-      <w:pPr>
-        <w:spacing w:after="120" w:line="276"/>
-      </w:pPr>
-      <w:r>
-        <w:rPr>
-          <w:rFonts w:ascii="Times New Roman" w:cs="Times New Roman" w:eastAsia="Times New Roman" w:hAnsi="Times New Roman"/>
-          <w:sz w:val="20"/>
-          <w:szCs w:val="20"/>
-        </w:rPr>
-        <w:t xml:space="preserve">[23] Xu, J.; Li, Z. Information physics of intelligence: Unifying logical depth and entropy under thermodynamic constraints. arXiv 2025, 2511.19156.</w:t>
-      </w:r>
-    </w:p>
-    <w:p>
-      <w:pPr>
-        <w:spacing w:after="120" w:line="276"/>
-      </w:pPr>
-      <w:r>
-        <w:rPr>
-          <w:rFonts w:ascii="Times New Roman" w:cs="Times New Roman" w:eastAsia="Times New Roman" w:hAnsi="Times New Roman"/>
-          <w:sz w:val="20"/>
-          <w:szCs w:val="20"/>
-        </w:rPr>
-        <w:t xml:space="preserve">[24] Han, J. Intelligence inertia: Physical principles and applications. arXiv 2026, 2603.22347.</w:t>
-      </w:r>
-    </w:p>
-    <w:p>
-      <w:pPr>
-        <w:spacing w:after="120" w:line="276"/>
-      </w:pPr>
-      <w:r>
-        <w:rPr>
-          <w:rFonts w:ascii="Times New Roman" w:cs="Times New Roman" w:eastAsia="Times New Roman" w:hAnsi="Times New Roman"/>
-          <w:sz w:val="20"/>
-          <w:szCs w:val="20"/>
-        </w:rPr>
-        <w:t xml:space="preserve">[25] Saad-Falcon, J. et al. Intelligence per watt: Measuring intelligence efficiency of local AI. arXiv 2025, 2511.07885.</w:t>
+        <w:t xml:space="preserve">[1] Legg, S.; Hutter, M. Universal intelligence: A definition of machine intelligence. Minds and Machines 2007, 17, 391–444. doi: 10.1007/s11023-007-9079-x.</w:t>
+      </w:r>
+    </w:p>
+    <w:p>
+      <w:pPr>
+        <w:spacing w:after="120" w:line="276"/>
+      </w:pPr>
+      <w:r>
+        <w:rPr>
+          <w:rFonts w:ascii="Times New Roman" w:cs="Times New Roman" w:eastAsia="Times New Roman" w:hAnsi="Times New Roman"/>
+          <w:sz w:val="20"/>
+          <w:szCs w:val="20"/>
+        </w:rPr>
+        <w:t xml:space="preserve">[2] Chollet, F. On the measure of intelligence. 2019.</w:t>
+      </w:r>
+    </w:p>
+    <w:p>
+      <w:pPr>
+        <w:spacing w:after="120" w:line="276"/>
+      </w:pPr>
+      <w:r>
+        <w:rPr>
+          <w:rFonts w:ascii="Times New Roman" w:cs="Times New Roman" w:eastAsia="Times New Roman" w:hAnsi="Times New Roman"/>
+          <w:sz w:val="20"/>
+          <w:szCs w:val="20"/>
+        </w:rPr>
+        <w:t xml:space="preserve">[3] Gignac, G.E.; Szodorai, E.T. Defining intelligence: Bridging the gap between human and artificial perspectives. Intelligence 2024, 104, 101832. doi: 10.1016/j.intell.2024.101832.</w:t>
+      </w:r>
+    </w:p>
+    <w:p>
+      <w:pPr>
+        <w:spacing w:after="120" w:line="276"/>
+      </w:pPr>
+      <w:r>
+        <w:rPr>
+          <w:rFonts w:ascii="Times New Roman" w:cs="Times New Roman" w:eastAsia="Times New Roman" w:hAnsi="Times New Roman"/>
+          <w:sz w:val="20"/>
+          <w:szCs w:val="20"/>
+        </w:rPr>
+        <w:t xml:space="preserve">[4] Sternberg, R.J. What is intelligence, really? The futile search for a Holy Grail. Learning and Individual Differences 2024, 116, 102568. doi: 10.1016/j.lindif.2024.102568.</w:t>
+      </w:r>
+    </w:p>
+    <w:p>
+      <w:pPr>
+        <w:spacing w:after="120" w:line="276"/>
+      </w:pPr>
+      <w:r>
+        <w:rPr>
+          <w:rFonts w:ascii="Times New Roman" w:cs="Times New Roman" w:eastAsia="Times New Roman" w:hAnsi="Times New Roman"/>
+          <w:sz w:val="20"/>
+          <w:szCs w:val="20"/>
+        </w:rPr>
+        <w:t xml:space="preserve">[5] Friston, K. The free-energy principle: A unified brain theory? Nature Reviews Neuroscience 2010, 11, 127–138. doi: 10.1038/nrn2787.</w:t>
+      </w:r>
+    </w:p>
+    <w:p>
+      <w:pPr>
+        <w:spacing w:after="120" w:line="276"/>
+      </w:pPr>
+      <w:r>
+        <w:rPr>
+          <w:rFonts w:ascii="Times New Roman" w:cs="Times New Roman" w:eastAsia="Times New Roman" w:hAnsi="Times New Roman"/>
+          <w:sz w:val="20"/>
+          <w:szCs w:val="20"/>
+        </w:rPr>
+        <w:t xml:space="preserve">[6] Ramstead, M.J.D. et al. On Bayesian mechanics: A physics of and by beliefs. Interface Focus 2023, 13, 20220029. doi: 10.1098/rsfs.2022.0029.</w:t>
+      </w:r>
+    </w:p>
+    <w:p>
+      <w:pPr>
+        <w:spacing w:after="120" w:line="276"/>
+      </w:pPr>
+      <w:r>
+        <w:rPr>
+          <w:rFonts w:ascii="Times New Roman" w:cs="Times New Roman" w:eastAsia="Times New Roman" w:hAnsi="Times New Roman"/>
+          <w:sz w:val="20"/>
+          <w:szCs w:val="20"/>
+        </w:rPr>
+        <w:t xml:space="preserve">[7] Pezzulo, G.; Parr, T.; Friston, K. Active inference as a theory of sentient behavior. Biological Psychology 2024, 186, 108741. doi: 10.1016/j.biopsycho.2023.108741.</w:t>
+      </w:r>
+    </w:p>
+    <w:p>
+      <w:pPr>
+        <w:spacing w:after="120" w:line="276"/>
+      </w:pPr>
+      <w:r>
+        <w:rPr>
+          <w:rFonts w:ascii="Times New Roman" w:cs="Times New Roman" w:eastAsia="Times New Roman" w:hAnsi="Times New Roman"/>
+          <w:sz w:val="20"/>
+          <w:szCs w:val="20"/>
+        </w:rPr>
+        <w:t xml:space="preserve">[8] Pezzulo, G.; Parr, T.; Cisek, P.; Clark, A.; Friston, K. Generating meaning: Active inference and the scope and limits of passive AI. Trends in Cognitive Sciences 2024, 28, 97–112. doi: 10.1016/j.tics.2023.10.002.</w:t>
+      </w:r>
+    </w:p>
+    <w:p>
+      <w:pPr>
+        <w:spacing w:after="120" w:line="276"/>
+      </w:pPr>
+      <w:r>
+        <w:rPr>
+          <w:rFonts w:ascii="Times New Roman" w:cs="Times New Roman" w:eastAsia="Times New Roman" w:hAnsi="Times New Roman"/>
+          <w:sz w:val="20"/>
+          <w:szCs w:val="20"/>
+        </w:rPr>
+        <w:t xml:space="preserve">[9] Landauer, R. Irreversibility and heat generation in the computing process. IBM Journal of Research and Development 1961, 5, 183–191. doi: 10.1147/rd.53.0183.</w:t>
+      </w:r>
+    </w:p>
+    <w:p>
+      <w:pPr>
+        <w:spacing w:after="120" w:line="276"/>
+      </w:pPr>
+      <w:r>
+        <w:rPr>
+          <w:rFonts w:ascii="Times New Roman" w:cs="Times New Roman" w:eastAsia="Times New Roman" w:hAnsi="Times New Roman"/>
+          <w:sz w:val="20"/>
+          <w:szCs w:val="20"/>
+        </w:rPr>
+        <w:t xml:space="preserve">[10] Still, S.; Sivak, D.A.; Bell, A.J.; Crooks, G.E. Thermodynamics of prediction. Physical Review Letters 2012, 109, 120604. doi: 10.1103/PhysRevLett.109.120604.</w:t>
+      </w:r>
+    </w:p>
+    <w:p>
+      <w:pPr>
+        <w:spacing w:after="120" w:line="276"/>
+      </w:pPr>
+      <w:r>
+        <w:rPr>
+          <w:rFonts w:ascii="Times New Roman" w:cs="Times New Roman" w:eastAsia="Times New Roman" w:hAnsi="Times New Roman"/>
+          <w:sz w:val="20"/>
+          <w:szCs w:val="20"/>
+        </w:rPr>
+        <w:t xml:space="preserve">[11] England, J.L. Dissipative adaptation in driven self-assembly. Nature Nanotechnology 2015, 10, 919–923. doi: 10.1038/nnano.2015.250.</w:t>
+      </w:r>
+    </w:p>
+    <w:p>
+      <w:pPr>
+        <w:spacing w:after="120" w:line="276"/>
+      </w:pPr>
+      <w:r>
+        <w:rPr>
+          <w:rFonts w:ascii="Times New Roman" w:cs="Times New Roman" w:eastAsia="Times New Roman" w:hAnsi="Times New Roman"/>
+          <w:sz w:val="20"/>
+          <w:szCs w:val="20"/>
+        </w:rPr>
+        <w:t xml:space="preserve">[12] Ali, A.; Ahmad, N.; de Groot, E.; van Gerven, M.A.J.; Kietzmann, T.C. Predictive coding is a consequence of energy efficiency in recurrent neural networks. Patterns 2022, 3, 100639. doi: 10.1016/j.patter.2022.100639.</w:t>
+      </w:r>
+    </w:p>
+    <w:p>
+      <w:pPr>
+        <w:spacing w:after="120" w:line="276"/>
+      </w:pPr>
+      <w:r>
+        <w:rPr>
+          <w:rFonts w:ascii="Times New Roman" w:cs="Times New Roman" w:eastAsia="Times New Roman" w:hAnsi="Times New Roman"/>
+          <w:sz w:val="20"/>
+          <w:szCs w:val="20"/>
+        </w:rPr>
+        <w:t xml:space="preserve">[13] Kolchinsky, A.; Wolpert, D.H. Semantic information, autonomous agency and nonequilibrium statistical physics. Interface Focus 2018, 8, 20180041. doi: 10.1098/rsfs.2018.0041.</w:t>
+      </w:r>
+    </w:p>
+    <w:p>
+      <w:pPr>
+        <w:spacing w:after="120" w:line="276"/>
+      </w:pPr>
+      <w:r>
+        <w:rPr>
+          <w:rFonts w:ascii="Times New Roman" w:cs="Times New Roman" w:eastAsia="Times New Roman" w:hAnsi="Times New Roman"/>
+          <w:sz w:val="20"/>
+          <w:szCs w:val="20"/>
+        </w:rPr>
+        <w:t xml:space="preserve">[14] Tishby, N.; Pereira, F.C.; Bialek, W. The information bottleneck method. In Proceedings of the 37th Annual Allerton Conference on Communication, Control, and Computing, 1999.</w:t>
+      </w:r>
+    </w:p>
+    <w:p>
+      <w:pPr>
+        <w:spacing w:after="120" w:line="276"/>
+      </w:pPr>
+      <w:r>
+        <w:rPr>
+          <w:rFonts w:ascii="Times New Roman" w:cs="Times New Roman" w:eastAsia="Times New Roman" w:hAnsi="Times New Roman"/>
+          <w:sz w:val="20"/>
+          <w:szCs w:val="20"/>
+        </w:rPr>
+        <w:t xml:space="preserve">[15] Klyubin, A.S.; Polani, D.; Nehaniv, C.L. All else being equal be empowered. In Advances in Artificial Life: ECAL 2005, LNCS 3630, pp. 744–753. doi: 10.1007/11553090_75.</w:t>
+      </w:r>
+    </w:p>
+    <w:p>
+      <w:pPr>
+        <w:spacing w:after="120" w:line="276"/>
+      </w:pPr>
+      <w:r>
+        <w:rPr>
+          <w:rFonts w:ascii="Times New Roman" w:cs="Times New Roman" w:eastAsia="Times New Roman" w:hAnsi="Times New Roman"/>
+          <w:sz w:val="20"/>
+          <w:szCs w:val="20"/>
+        </w:rPr>
+        <w:t xml:space="preserve">[16] Tiomkin, S.; Nemenman, I.; Polani, D.; Tishby, N. Intrinsic motivation in dynamical control systems. PRX Life 2024, 2, 033009. doi: 10.1103/PRXLife.2.033009.</w:t>
+      </w:r>
+    </w:p>
+    <w:p>
+      <w:pPr>
+        <w:spacing w:after="120" w:line="276"/>
+      </w:pPr>
+      <w:r>
+        <w:rPr>
+          <w:rFonts w:ascii="Times New Roman" w:cs="Times New Roman" w:eastAsia="Times New Roman" w:hAnsi="Times New Roman"/>
+          <w:sz w:val="20"/>
+          <w:szCs w:val="20"/>
+        </w:rPr>
+        <w:t xml:space="preserve">[17] Kiefer, A.B. Intrinsic motivation as constrained entropy maximization. Entropy 2025, 27, 372. doi: 10.3390/e27040372.</w:t>
+      </w:r>
+    </w:p>
+    <w:p>
+      <w:pPr>
+        <w:spacing w:after="120" w:line="276"/>
+      </w:pPr>
+      <w:r>
+        <w:rPr>
+          <w:rFonts w:ascii="Times New Roman" w:cs="Times New Roman" w:eastAsia="Times New Roman" w:hAnsi="Times New Roman"/>
+          <w:sz w:val="20"/>
+          <w:szCs w:val="20"/>
+        </w:rPr>
+        <w:t xml:space="preserve">[18] Takahashi, K.; Hayashi, Y. Thermodynamic limits of physical intelligence. 2026.</w:t>
+      </w:r>
+    </w:p>
+    <w:p>
+      <w:pPr>
+        <w:spacing w:after="120" w:line="276"/>
+      </w:pPr>
+      <w:r>
+        <w:rPr>
+          <w:rFonts w:ascii="Times New Roman" w:cs="Times New Roman" w:eastAsia="Times New Roman" w:hAnsi="Times New Roman"/>
+          <w:sz w:val="20"/>
+          <w:szCs w:val="20"/>
+        </w:rPr>
+        <w:t xml:space="preserve">[19] Fagan, P.D. Toward a physical theory of intelligence. 2025.</w:t>
+      </w:r>
+    </w:p>
+    <w:p>
+      <w:pPr>
+        <w:spacing w:after="120" w:line="276"/>
+      </w:pPr>
+      <w:r>
+        <w:rPr>
+          <w:rFonts w:ascii="Times New Roman" w:cs="Times New Roman" w:eastAsia="Times New Roman" w:hAnsi="Times New Roman"/>
+          <w:sz w:val="20"/>
+          <w:szCs w:val="20"/>
+        </w:rPr>
+        <w:t xml:space="preserve">[20] Perrier, E. Watts-per-intelligence: Part I (energy efficiency). 2025.</w:t>
+      </w:r>
+    </w:p>
+    <w:p>
+      <w:pPr>
+        <w:spacing w:after="120" w:line="276"/>
+      </w:pPr>
+      <w:r>
+        <w:rPr>
+          <w:rFonts w:ascii="Times New Roman" w:cs="Times New Roman" w:eastAsia="Times New Roman" w:hAnsi="Times New Roman"/>
+          <w:sz w:val="20"/>
+          <w:szCs w:val="20"/>
+        </w:rPr>
+        <w:t xml:space="preserve">[21] Xu, J.; Li, Z. Information physics of intelligence: Unifying logical depth and entropy under thermodynamic constraints. 2025.</w:t>
+      </w:r>
+    </w:p>
+    <w:p>
+      <w:pPr>
+        <w:spacing w:after="120" w:line="276"/>
+      </w:pPr>
+      <w:r>
+        <w:rPr>
+          <w:rFonts w:ascii="Times New Roman" w:cs="Times New Roman" w:eastAsia="Times New Roman" w:hAnsi="Times New Roman"/>
+          <w:sz w:val="20"/>
+          <w:szCs w:val="20"/>
+        </w:rPr>
+        <w:t xml:space="preserve">[22] Han, J. Intelligence inertia: Physical principles and applications. 2026.</w:t>
+      </w:r>
+    </w:p>
+    <w:p>
+      <w:pPr>
+        <w:spacing w:after="120" w:line="276"/>
+      </w:pPr>
+      <w:r>
+        <w:rPr>
+          <w:rFonts w:ascii="Times New Roman" w:cs="Times New Roman" w:eastAsia="Times New Roman" w:hAnsi="Times New Roman"/>
+          <w:sz w:val="20"/>
+          <w:szCs w:val="20"/>
+        </w:rPr>
+        <w:t xml:space="preserve">[23] Saad-Falcon, J.; Avanika, M. et al. Intelligence per watt: Measuring intelligence efficiency of local AI. 2025.</w:t>
       </w:r>
     </w:p>
     <w:sectPr>

</xml_diff>